<commit_message>
Rebuild submittal templates to match the real Centric visual style
Previous version applied PMI/PMBOK styling (dark navy headers, white text,
horizontal rules, extra sub-section headings) that did not match the
actual Centric submittal package format.

Rebuilt to mirror the real PDFs:
- Transmittal: centered black title, light-blue (#DAE3F3) label cells,
  no horizontal rules, no sub-section headers
- Cover Sheet: dark-navy banner (#1F3864) with white title + subtitle,
  bold all-caps section headers, underline-only KV pairs in body
- Index: same banner style, two clean light-blue-header tables for
  Items Submitted and Known Deviations

Removed the speculative A/E Review Stamp from the Cover Sheet -- not in
the original format.
</commit_message>
<xml_diff>
--- a/templates/submittals/01_Transmittal.docx
+++ b/templates/submittals/01_Transmittal.docx
@@ -7,6 +7,7 @@
         <w:rPr>
           <w:rFonts w:ascii="Calibri" w:hAnsi="Calibri"/>
           <w:b/>
+          <w:color w:val="000000"/>
           <w:sz w:val="22"/>
         </w:rPr>
         <w:t>[Company Name]</w:t>
@@ -17,6 +18,7 @@
         <w:rPr>
           <w:rFonts w:ascii="Calibri" w:hAnsi="Calibri"/>
           <w:b w:val="0"/>
+          <w:color w:val="000000"/>
           <w:sz w:val="18"/>
         </w:rPr>
         <w:t>[Street Address]</w:t>
@@ -27,6 +29,7 @@
         <w:rPr>
           <w:rFonts w:ascii="Calibri" w:hAnsi="Calibri"/>
           <w:b w:val="0"/>
+          <w:color w:val="000000"/>
           <w:sz w:val="18"/>
         </w:rPr>
         <w:t>[City, State ZIP]</w:t>
@@ -37,6 +40,7 @@
         <w:rPr>
           <w:rFonts w:ascii="Calibri" w:hAnsi="Calibri"/>
           <w:b w:val="0"/>
+          <w:color w:val="000000"/>
           <w:sz w:val="18"/>
         </w:rPr>
         <w:t>[Phone]</w:t>
@@ -47,18 +51,14 @@
         <w:rPr>
           <w:rFonts w:ascii="Calibri" w:hAnsi="Calibri"/>
           <w:b w:val="0"/>
+          <w:color w:val="0563C1"/>
           <w:sz w:val="18"/>
+          <w:u w:val="single"/>
         </w:rPr>
         <w:t>[Website]</w:t>
       </w:r>
     </w:p>
-    <w:p>
-      <w:pPr>
-        <w:pBdr>
-          <w:bottom w:val="single" w:sz="6" w:space="1" w:color="1F3A5F"/>
-        </w:pBdr>
-      </w:pPr>
-    </w:p>
+    <w:p/>
     <w:p>
       <w:pPr>
         <w:jc w:val="center"/>
@@ -67,8 +67,8 @@
         <w:rPr>
           <w:rFonts w:ascii="Calibri" w:hAnsi="Calibri"/>
           <w:b/>
-          <w:color w:val="1F3A5F"/>
-          <w:sz w:val="32"/>
+          <w:color w:val="000000"/>
+          <w:sz w:val="40"/>
         </w:rPr>
         <w:t>TRANSMITTAL</w:t>
       </w:r>
@@ -76,10 +76,17 @@
     <w:p/>
     <w:tbl>
       <w:tblPr>
-        <w:tblStyle w:val="LightList-Accent1"/>
         <w:tblW w:type="auto" w:w="0"/>
         <w:tblLayout w:type="fixed"/>
         <w:tblLook w:firstColumn="1" w:firstRow="1" w:lastColumn="0" w:lastRow="0" w:noHBand="0" w:noVBand="1" w:val="04A0"/>
+        <w:tblBorders>
+          <w:top w:val="single" w:sz="4" w:space="0" w:color="7F7F7F"/>
+          <w:left w:val="single" w:sz="4" w:space="0" w:color="7F7F7F"/>
+          <w:bottom w:val="single" w:sz="4" w:space="0" w:color="7F7F7F"/>
+          <w:right w:val="single" w:sz="4" w:space="0" w:color="7F7F7F"/>
+          <w:insideH w:val="single" w:sz="4" w:space="0" w:color="7F7F7F"/>
+          <w:insideV w:val="single" w:sz="4" w:space="0" w:color="7F7F7F"/>
+        </w:tblBorders>
       </w:tblPr>
       <w:tblGrid>
         <w:gridCol w:w="5112"/>
@@ -89,7 +96,7 @@
         <w:tc>
           <w:tcPr>
             <w:tcW w:type="dxa" w:w="1440"/>
-            <w:shd w:val="clear" w:color="auto" w:fill="1F3A5F"/>
+            <w:shd w:val="clear" w:color="auto" w:fill="DAE3F3"/>
           </w:tcPr>
           <w:p>
             <w:r/>
@@ -97,8 +104,8 @@
               <w:rPr>
                 <w:rFonts w:ascii="Calibri" w:hAnsi="Calibri"/>
                 <w:b/>
-                <w:color w:val="FFFFFF"/>
-                <w:sz w:val="18"/>
+                <w:color w:val="000000"/>
+                <w:sz w:val="20"/>
               </w:rPr>
               <w:t>DATE:</w:t>
             </w:r>
@@ -106,7 +113,7 @@
         </w:tc>
         <w:tc>
           <w:tcPr>
-            <w:tcW w:type="dxa" w:w="8640"/>
+            <w:tcW w:type="dxa" w:w="8784"/>
           </w:tcPr>
           <w:p>
             <w:r/>
@@ -114,6 +121,7 @@
               <w:rPr>
                 <w:rFonts w:ascii="Calibri" w:hAnsi="Calibri"/>
                 <w:b w:val="0"/>
+                <w:color w:val="000000"/>
                 <w:sz w:val="20"/>
               </w:rPr>
               <w:t>[YYYY-MM-DD]</w:t>
@@ -125,10 +133,17 @@
     <w:p/>
     <w:tbl>
       <w:tblPr>
-        <w:tblStyle w:val="LightGrid-Accent1"/>
         <w:tblW w:type="auto" w:w="0"/>
         <w:tblLayout w:type="fixed"/>
         <w:tblLook w:firstColumn="1" w:firstRow="1" w:lastColumn="0" w:lastRow="0" w:noHBand="0" w:noVBand="1" w:val="04A0"/>
+        <w:tblBorders>
+          <w:top w:val="single" w:sz="4" w:space="0" w:color="7F7F7F"/>
+          <w:left w:val="single" w:sz="4" w:space="0" w:color="7F7F7F"/>
+          <w:bottom w:val="single" w:sz="4" w:space="0" w:color="7F7F7F"/>
+          <w:right w:val="single" w:sz="4" w:space="0" w:color="7F7F7F"/>
+          <w:insideH w:val="single" w:sz="4" w:space="0" w:color="7F7F7F"/>
+          <w:insideV w:val="single" w:sz="4" w:space="0" w:color="7F7F7F"/>
+        </w:tblBorders>
       </w:tblPr>
       <w:tblGrid>
         <w:gridCol w:w="2556"/>
@@ -139,8 +154,8 @@
       <w:tr>
         <w:tc>
           <w:tcPr>
-            <w:tcW w:type="dxa" w:w="1008"/>
-            <w:shd w:val="clear" w:color="auto" w:fill="1F3A5F"/>
+            <w:tcW w:type="dxa" w:w="1296"/>
+            <w:shd w:val="clear" w:color="auto" w:fill="DAE3F3"/>
           </w:tcPr>
           <w:p>
             <w:r/>
@@ -148,8 +163,8 @@
               <w:rPr>
                 <w:rFonts w:ascii="Calibri" w:hAnsi="Calibri"/>
                 <w:b/>
-                <w:color w:val="FFFFFF"/>
-                <w:sz w:val="18"/>
+                <w:color w:val="000000"/>
+                <w:sz w:val="20"/>
               </w:rPr>
               <w:t>TO:</w:t>
             </w:r>
@@ -165,6 +180,7 @@
               <w:rPr>
                 <w:rFonts w:ascii="Calibri" w:hAnsi="Calibri"/>
                 <w:b w:val="0"/>
+                <w:color w:val="000000"/>
                 <w:sz w:val="20"/>
               </w:rPr>
               <w:t>[Recipient Firm]</w:t>
@@ -173,8 +189,8 @@
         </w:tc>
         <w:tc>
           <w:tcPr>
-            <w:tcW w:type="dxa" w:w="1008"/>
-            <w:shd w:val="clear" w:color="auto" w:fill="1F3A5F"/>
+            <w:tcW w:type="dxa" w:w="1440"/>
+            <w:shd w:val="clear" w:color="auto" w:fill="DAE3F3"/>
           </w:tcPr>
           <w:p>
             <w:r/>
@@ -182,8 +198,8 @@
               <w:rPr>
                 <w:rFonts w:ascii="Calibri" w:hAnsi="Calibri"/>
                 <w:b/>
-                <w:color w:val="FFFFFF"/>
-                <w:sz w:val="18"/>
+                <w:color w:val="000000"/>
+                <w:sz w:val="20"/>
               </w:rPr>
               <w:t>VIA:</w:t>
             </w:r>
@@ -191,7 +207,7 @@
         </w:tc>
         <w:tc>
           <w:tcPr>
-            <w:tcW w:type="dxa" w:w="3888"/>
+            <w:tcW w:type="dxa" w:w="3168"/>
           </w:tcPr>
           <w:p>
             <w:r/>
@@ -199,9 +215,10 @@
               <w:rPr>
                 <w:rFonts w:ascii="Calibri" w:hAnsi="Calibri"/>
                 <w:b w:val="0"/>
-                <w:sz w:val="18"/>
+                <w:color w:val="000000"/>
+                <w:sz w:val="20"/>
               </w:rPr>
-              <w:t>[ ] U.S. MAIL</w:t>
+              <w:t>U.S. MAIL</w:t>
             </w:r>
           </w:p>
         </w:tc>
@@ -209,8 +226,8 @@
       <w:tr>
         <w:tc>
           <w:tcPr>
-            <w:tcW w:type="dxa" w:w="1008"/>
-            <w:shd w:val="clear" w:color="auto" w:fill="1F3A5F"/>
+            <w:tcW w:type="dxa" w:w="1296"/>
+            <w:shd w:val="clear" w:color="auto" w:fill="DAE3F3"/>
           </w:tcPr>
           <w:p>
             <w:r/>
@@ -218,8 +235,8 @@
               <w:rPr>
                 <w:rFonts w:ascii="Calibri" w:hAnsi="Calibri"/>
                 <w:b/>
-                <w:color w:val="FFFFFF"/>
-                <w:sz w:val="18"/>
+                <w:color w:val="000000"/>
+                <w:sz w:val="20"/>
               </w:rPr>
               <w:t>ATTN:</w:t>
             </w:r>
@@ -235,6 +252,7 @@
               <w:rPr>
                 <w:rFonts w:ascii="Calibri" w:hAnsi="Calibri"/>
                 <w:b w:val="0"/>
+                <w:color w:val="000000"/>
                 <w:sz w:val="20"/>
               </w:rPr>
               <w:t>[Recipient Name]</w:t>
@@ -243,15 +261,7 @@
         </w:tc>
         <w:tc>
           <w:tcPr>
-            <w:tcW w:type="dxa" w:w="1008"/>
-          </w:tcPr>
-          <w:p>
-            <w:r/>
-          </w:p>
-        </w:tc>
-        <w:tc>
-          <w:tcPr>
-            <w:tcW w:type="dxa" w:w="3888"/>
+            <w:tcW w:type="dxa" w:w="1440"/>
           </w:tcPr>
           <w:p>
             <w:r/>
@@ -259,9 +269,26 @@
               <w:rPr>
                 <w:rFonts w:ascii="Calibri" w:hAnsi="Calibri"/>
                 <w:b w:val="0"/>
-                <w:sz w:val="18"/>
+                <w:color w:val="000000"/>
+                <w:sz w:val="20"/>
               </w:rPr>
-              <w:t>[ ] HAND DELIVERED</w:t>
+            </w:r>
+          </w:p>
+        </w:tc>
+        <w:tc>
+          <w:tcPr>
+            <w:tcW w:type="dxa" w:w="3168"/>
+          </w:tcPr>
+          <w:p>
+            <w:r/>
+            <w:r>
+              <w:rPr>
+                <w:rFonts w:ascii="Calibri" w:hAnsi="Calibri"/>
+                <w:b w:val="0"/>
+                <w:color w:val="000000"/>
+                <w:sz w:val="20"/>
+              </w:rPr>
+              <w:t>HAND DELIVERED</w:t>
             </w:r>
           </w:p>
         </w:tc>
@@ -269,10 +296,18 @@
       <w:tr>
         <w:tc>
           <w:tcPr>
-            <w:tcW w:type="dxa" w:w="1008"/>
+            <w:tcW w:type="dxa" w:w="1296"/>
           </w:tcPr>
           <w:p>
             <w:r/>
+            <w:r>
+              <w:rPr>
+                <w:rFonts w:ascii="Calibri" w:hAnsi="Calibri"/>
+                <w:b w:val="0"/>
+                <w:color w:val="000000"/>
+                <w:sz w:val="20"/>
+              </w:rPr>
+            </w:r>
           </w:p>
         </w:tc>
         <w:tc>
@@ -285,6 +320,7 @@
               <w:rPr>
                 <w:rFonts w:ascii="Calibri" w:hAnsi="Calibri"/>
                 <w:b w:val="0"/>
+                <w:color w:val="000000"/>
                 <w:sz w:val="20"/>
               </w:rPr>
               <w:t>[Street Address]</w:t>
@@ -293,15 +329,7 @@
         </w:tc>
         <w:tc>
           <w:tcPr>
-            <w:tcW w:type="dxa" w:w="1008"/>
-          </w:tcPr>
-          <w:p>
-            <w:r/>
-          </w:p>
-        </w:tc>
-        <w:tc>
-          <w:tcPr>
-            <w:tcW w:type="dxa" w:w="3888"/>
+            <w:tcW w:type="dxa" w:w="1440"/>
           </w:tcPr>
           <w:p>
             <w:r/>
@@ -309,9 +337,26 @@
               <w:rPr>
                 <w:rFonts w:ascii="Calibri" w:hAnsi="Calibri"/>
                 <w:b w:val="0"/>
-                <w:sz w:val="18"/>
+                <w:color w:val="000000"/>
+                <w:sz w:val="20"/>
               </w:rPr>
-              <w:t>[ ] LOCAL DELIVERY</w:t>
+            </w:r>
+          </w:p>
+        </w:tc>
+        <w:tc>
+          <w:tcPr>
+            <w:tcW w:type="dxa" w:w="3168"/>
+          </w:tcPr>
+          <w:p>
+            <w:r/>
+            <w:r>
+              <w:rPr>
+                <w:rFonts w:ascii="Calibri" w:hAnsi="Calibri"/>
+                <w:b w:val="0"/>
+                <w:color w:val="000000"/>
+                <w:sz w:val="20"/>
+              </w:rPr>
+              <w:t>LOCAL DELIVERY</w:t>
             </w:r>
           </w:p>
         </w:tc>
@@ -319,10 +364,18 @@
       <w:tr>
         <w:tc>
           <w:tcPr>
-            <w:tcW w:type="dxa" w:w="1008"/>
+            <w:tcW w:type="dxa" w:w="1296"/>
           </w:tcPr>
           <w:p>
             <w:r/>
+            <w:r>
+              <w:rPr>
+                <w:rFonts w:ascii="Calibri" w:hAnsi="Calibri"/>
+                <w:b w:val="0"/>
+                <w:color w:val="000000"/>
+                <w:sz w:val="20"/>
+              </w:rPr>
+            </w:r>
           </w:p>
         </w:tc>
         <w:tc>
@@ -335,6 +388,7 @@
               <w:rPr>
                 <w:rFonts w:ascii="Calibri" w:hAnsi="Calibri"/>
                 <w:b w:val="0"/>
+                <w:color w:val="000000"/>
                 <w:sz w:val="20"/>
               </w:rPr>
               <w:t>[City, State ZIP]</w:t>
@@ -343,15 +397,7 @@
         </w:tc>
         <w:tc>
           <w:tcPr>
-            <w:tcW w:type="dxa" w:w="1008"/>
-          </w:tcPr>
-          <w:p>
-            <w:r/>
-          </w:p>
-        </w:tc>
-        <w:tc>
-          <w:tcPr>
-            <w:tcW w:type="dxa" w:w="3888"/>
+            <w:tcW w:type="dxa" w:w="1440"/>
           </w:tcPr>
           <w:p>
             <w:r/>
@@ -359,9 +405,26 @@
               <w:rPr>
                 <w:rFonts w:ascii="Calibri" w:hAnsi="Calibri"/>
                 <w:b w:val="0"/>
-                <w:sz w:val="18"/>
+                <w:color w:val="000000"/>
+                <w:sz w:val="20"/>
               </w:rPr>
-              <w:t>[ ] OVERNIGHT SHIPMENT</w:t>
+            </w:r>
+          </w:p>
+        </w:tc>
+        <w:tc>
+          <w:tcPr>
+            <w:tcW w:type="dxa" w:w="3168"/>
+          </w:tcPr>
+          <w:p>
+            <w:r/>
+            <w:r>
+              <w:rPr>
+                <w:rFonts w:ascii="Calibri" w:hAnsi="Calibri"/>
+                <w:b w:val="0"/>
+                <w:color w:val="000000"/>
+                <w:sz w:val="20"/>
+              </w:rPr>
+              <w:t>OVERNIGHT SHIPMENT</w:t>
             </w:r>
           </w:p>
         </w:tc>
@@ -369,10 +432,18 @@
       <w:tr>
         <w:tc>
           <w:tcPr>
-            <w:tcW w:type="dxa" w:w="1008"/>
+            <w:tcW w:type="dxa" w:w="1296"/>
           </w:tcPr>
           <w:p>
             <w:r/>
+            <w:r>
+              <w:rPr>
+                <w:rFonts w:ascii="Calibri" w:hAnsi="Calibri"/>
+                <w:b w:val="0"/>
+                <w:color w:val="000000"/>
+                <w:sz w:val="20"/>
+              </w:rPr>
+            </w:r>
           </w:p>
         </w:tc>
         <w:tc>
@@ -381,19 +452,39 @@
           </w:tcPr>
           <w:p>
             <w:r/>
+            <w:r>
+              <w:rPr>
+                <w:rFonts w:ascii="Calibri" w:hAnsi="Calibri"/>
+                <w:b w:val="0"/>
+                <w:color w:val="000000"/>
+                <w:sz w:val="20"/>
+              </w:rPr>
+            </w:r>
           </w:p>
         </w:tc>
         <w:tc>
           <w:tcPr>
-            <w:tcW w:type="dxa" w:w="1008"/>
+            <w:tcW w:type="dxa" w:w="1440"/>
           </w:tcPr>
           <w:p>
+            <w:pPr>
+              <w:jc w:val="center"/>
+            </w:pPr>
             <w:r/>
+            <w:r>
+              <w:rPr>
+                <w:rFonts w:ascii="Calibri" w:hAnsi="Calibri"/>
+                <w:b/>
+                <w:color w:val="000000"/>
+                <w:sz w:val="20"/>
+              </w:rPr>
+              <w:t>x</w:t>
+            </w:r>
           </w:p>
         </w:tc>
         <w:tc>
           <w:tcPr>
-            <w:tcW w:type="dxa" w:w="3888"/>
+            <w:tcW w:type="dxa" w:w="3168"/>
           </w:tcPr>
           <w:p>
             <w:r/>
@@ -401,9 +492,82 @@
               <w:rPr>
                 <w:rFonts w:ascii="Calibri" w:hAnsi="Calibri"/>
                 <w:b w:val="0"/>
-                <w:sz w:val="18"/>
+                <w:color w:val="000000"/>
+                <w:sz w:val="20"/>
               </w:rPr>
-              <w:t>[X] EMAIL</w:t>
+              <w:t>Email</w:t>
+            </w:r>
+          </w:p>
+        </w:tc>
+      </w:tr>
+      <w:tr>
+        <w:tc>
+          <w:tcPr>
+            <w:tcW w:type="dxa" w:w="1296"/>
+            <w:shd w:val="clear" w:color="auto" w:fill="DAE3F3"/>
+          </w:tcPr>
+          <w:p>
+            <w:r/>
+            <w:r>
+              <w:rPr>
+                <w:rFonts w:ascii="Calibri" w:hAnsi="Calibri"/>
+                <w:b/>
+                <w:color w:val="000000"/>
+                <w:sz w:val="20"/>
+              </w:rPr>
+              <w:t>PROJECT:</w:t>
+            </w:r>
+          </w:p>
+        </w:tc>
+        <w:tc>
+          <w:tcPr>
+            <w:tcW w:type="dxa" w:w="4320"/>
+          </w:tcPr>
+          <w:p>
+            <w:r/>
+            <w:r>
+              <w:rPr>
+                <w:rFonts w:ascii="Calibri" w:hAnsi="Calibri"/>
+                <w:b w:val="0"/>
+                <w:color w:val="000000"/>
+                <w:sz w:val="20"/>
+              </w:rPr>
+              <w:t>[Project Name]</w:t>
+            </w:r>
+          </w:p>
+        </w:tc>
+        <w:tc>
+          <w:tcPr>
+            <w:tcW w:type="dxa" w:w="1440"/>
+            <w:shd w:val="clear" w:color="auto" w:fill="DAE3F3"/>
+          </w:tcPr>
+          <w:p>
+            <w:r/>
+            <w:r>
+              <w:rPr>
+                <w:rFonts w:ascii="Calibri" w:hAnsi="Calibri"/>
+                <w:b/>
+                <w:color w:val="000000"/>
+                <w:sz w:val="20"/>
+              </w:rPr>
+              <w:t>PROJECT #</w:t>
+            </w:r>
+          </w:p>
+        </w:tc>
+        <w:tc>
+          <w:tcPr>
+            <w:tcW w:type="dxa" w:w="3168"/>
+          </w:tcPr>
+          <w:p>
+            <w:r/>
+            <w:r>
+              <w:rPr>
+                <w:rFonts w:ascii="Calibri" w:hAnsi="Calibri"/>
+                <w:b w:val="0"/>
+                <w:color w:val="000000"/>
+                <w:sz w:val="20"/>
+              </w:rPr>
+              <w:t>[Project #]</w:t>
             </w:r>
           </w:p>
         </w:tc>
@@ -412,20 +576,30 @@
     <w:p/>
     <w:tbl>
       <w:tblPr>
-        <w:tblStyle w:val="LightList-Accent1"/>
         <w:tblW w:type="auto" w:w="0"/>
         <w:tblLayout w:type="fixed"/>
         <w:tblLook w:firstColumn="1" w:firstRow="1" w:lastColumn="0" w:lastRow="0" w:noHBand="0" w:noVBand="1" w:val="04A0"/>
+        <w:tblBorders>
+          <w:top w:val="single" w:sz="4" w:space="0" w:color="7F7F7F"/>
+          <w:left w:val="single" w:sz="4" w:space="0" w:color="7F7F7F"/>
+          <w:bottom w:val="single" w:sz="4" w:space="0" w:color="7F7F7F"/>
+          <w:right w:val="single" w:sz="4" w:space="0" w:color="7F7F7F"/>
+          <w:insideH w:val="single" w:sz="4" w:space="0" w:color="7F7F7F"/>
+          <w:insideV w:val="single" w:sz="4" w:space="0" w:color="7F7F7F"/>
+        </w:tblBorders>
       </w:tblPr>
       <w:tblGrid>
-        <w:gridCol w:w="5112"/>
-        <w:gridCol w:w="5112"/>
+        <w:gridCol w:w="2045"/>
+        <w:gridCol w:w="2045"/>
+        <w:gridCol w:w="2045"/>
+        <w:gridCol w:w="2045"/>
+        <w:gridCol w:w="2045"/>
       </w:tblGrid>
       <w:tr>
         <w:tc>
           <w:tcPr>
             <w:tcW w:type="dxa" w:w="1728"/>
-            <w:shd w:val="clear" w:color="auto" w:fill="1F3A5F"/>
+            <w:shd w:val="clear" w:color="auto" w:fill="DAE3F3"/>
           </w:tcPr>
           <w:p>
             <w:r/>
@@ -433,16 +607,36 @@
               <w:rPr>
                 <w:rFonts w:ascii="Calibri" w:hAnsi="Calibri"/>
                 <w:b/>
-                <w:color w:val="FFFFFF"/>
-                <w:sz w:val="18"/>
+                <w:color w:val="000000"/>
+                <w:sz w:val="20"/>
               </w:rPr>
-              <w:t>PROJECT:</w:t>
+              <w:t>TRANSMITTED:</w:t>
             </w:r>
           </w:p>
         </w:tc>
         <w:tc>
           <w:tcPr>
-            <w:tcW w:type="dxa" w:w="8352"/>
+            <w:tcW w:type="dxa" w:w="576"/>
+          </w:tcPr>
+          <w:p>
+            <w:pPr>
+              <w:jc w:val="center"/>
+            </w:pPr>
+            <w:r/>
+            <w:r>
+              <w:rPr>
+                <w:rFonts w:ascii="Calibri" w:hAnsi="Calibri"/>
+                <w:b/>
+                <w:color w:val="000000"/>
+                <w:sz w:val="20"/>
+              </w:rPr>
+              <w:t>x</w:t>
+            </w:r>
+          </w:p>
+        </w:tc>
+        <w:tc>
+          <w:tcPr>
+            <w:tcW w:type="dxa" w:w="3024"/>
           </w:tcPr>
           <w:p>
             <w:r/>
@@ -450,9 +644,43 @@
               <w:rPr>
                 <w:rFonts w:ascii="Calibri" w:hAnsi="Calibri"/>
                 <w:b w:val="0"/>
+                <w:color w:val="000000"/>
                 <w:sz w:val="20"/>
               </w:rPr>
-              <w:t>[Project Name]</w:t>
+              <w:t>HEREWITH</w:t>
+            </w:r>
+          </w:p>
+        </w:tc>
+        <w:tc>
+          <w:tcPr>
+            <w:tcW w:type="dxa" w:w="576"/>
+          </w:tcPr>
+          <w:p>
+            <w:r/>
+            <w:r>
+              <w:rPr>
+                <w:rFonts w:ascii="Calibri" w:hAnsi="Calibri"/>
+                <w:b w:val="0"/>
+                <w:color w:val="000000"/>
+                <w:sz w:val="20"/>
+              </w:rPr>
+            </w:r>
+          </w:p>
+        </w:tc>
+        <w:tc>
+          <w:tcPr>
+            <w:tcW w:type="dxa" w:w="4320"/>
+          </w:tcPr>
+          <w:p>
+            <w:r/>
+            <w:r>
+              <w:rPr>
+                <w:rFonts w:ascii="Calibri" w:hAnsi="Calibri"/>
+                <w:b w:val="0"/>
+                <w:color w:val="000000"/>
+                <w:sz w:val="20"/>
+              </w:rPr>
+              <w:t>SEPARATELY</w:t>
             </w:r>
           </w:p>
         </w:tc>
@@ -461,7 +689,7 @@
         <w:tc>
           <w:tcPr>
             <w:tcW w:type="dxa" w:w="1728"/>
-            <w:shd w:val="clear" w:color="auto" w:fill="1F3A5F"/>
+            <w:shd w:val="clear" w:color="auto" w:fill="DAE3F3"/>
           </w:tcPr>
           <w:p>
             <w:r/>
@@ -469,16 +697,16 @@
               <w:rPr>
                 <w:rFonts w:ascii="Calibri" w:hAnsi="Calibri"/>
                 <w:b/>
-                <w:color w:val="FFFFFF"/>
-                <w:sz w:val="18"/>
+                <w:color w:val="000000"/>
+                <w:sz w:val="20"/>
               </w:rPr>
-              <w:t>PROJECT #:</w:t>
+              <w:t>ITEM:</w:t>
             </w:r>
           </w:p>
         </w:tc>
         <w:tc>
           <w:tcPr>
-            <w:tcW w:type="dxa" w:w="8352"/>
+            <w:tcW w:type="dxa" w:w="576"/>
           </w:tcPr>
           <w:p>
             <w:r/>
@@ -486,61 +714,15 @@
               <w:rPr>
                 <w:rFonts w:ascii="Calibri" w:hAnsi="Calibri"/>
                 <w:b w:val="0"/>
+                <w:color w:val="000000"/>
                 <w:sz w:val="20"/>
               </w:rPr>
-              <w:t>[Contract # / A&amp;E Project #]</w:t>
-            </w:r>
-          </w:p>
-        </w:tc>
-      </w:tr>
-    </w:tbl>
-    <w:p/>
-    <w:p>
-      <w:r>
-        <w:rPr>
-          <w:rFonts w:ascii="Calibri" w:hAnsi="Calibri"/>
-          <w:b/>
-          <w:color w:val="2E75B6"/>
-          <w:sz w:val="20"/>
-        </w:rPr>
-        <w:t>Transmitted</w:t>
-      </w:r>
-    </w:p>
-    <w:tbl>
-      <w:tblPr>
-        <w:tblStyle w:val="LightGrid-Accent1"/>
-        <w:tblW w:type="auto" w:w="0"/>
-        <w:tblLayout w:type="fixed"/>
-        <w:tblLook w:firstColumn="1" w:firstRow="1" w:lastColumn="0" w:lastRow="0" w:noHBand="0" w:noVBand="1" w:val="04A0"/>
-      </w:tblPr>
-      <w:tblGrid>
-        <w:gridCol w:w="2556"/>
-        <w:gridCol w:w="2556"/>
-        <w:gridCol w:w="2556"/>
-        <w:gridCol w:w="2556"/>
-      </w:tblGrid>
-      <w:tr>
-        <w:tc>
-          <w:tcPr>
-            <w:tcW w:type="dxa" w:w="1728"/>
-            <w:shd w:val="clear" w:color="auto" w:fill="1F3A5F"/>
-          </w:tcPr>
-          <w:p>
-            <w:r/>
-            <w:r>
-              <w:rPr>
-                <w:rFonts w:ascii="Calibri" w:hAnsi="Calibri"/>
-                <w:b/>
-                <w:color w:val="FFFFFF"/>
-                <w:sz w:val="18"/>
-              </w:rPr>
-              <w:t>TRANSMITTED:</w:t>
             </w:r>
           </w:p>
         </w:tc>
         <w:tc>
           <w:tcPr>
-            <w:tcW w:type="dxa" w:w="2736"/>
+            <w:tcW w:type="dxa" w:w="3024"/>
           </w:tcPr>
           <w:p>
             <w:r/>
@@ -548,15 +730,16 @@
               <w:rPr>
                 <w:rFonts w:ascii="Calibri" w:hAnsi="Calibri"/>
                 <w:b w:val="0"/>
-                <w:sz w:val="18"/>
+                <w:color w:val="000000"/>
+                <w:sz w:val="20"/>
               </w:rPr>
-              <w:t>[X] HEREWITH</w:t>
+              <w:t>ORIGINAL DRAWINGS</w:t>
             </w:r>
           </w:p>
         </w:tc>
         <w:tc>
           <w:tcPr>
-            <w:tcW w:type="dxa" w:w="2880"/>
+            <w:tcW w:type="dxa" w:w="576"/>
           </w:tcPr>
           <w:p>
             <w:r/>
@@ -564,14 +747,15 @@
               <w:rPr>
                 <w:rFonts w:ascii="Calibri" w:hAnsi="Calibri"/>
                 <w:b w:val="0"/>
-                <w:sz w:val="18"/>
+                <w:color w:val="000000"/>
+                <w:sz w:val="20"/>
               </w:rPr>
             </w:r>
           </w:p>
         </w:tc>
         <w:tc>
           <w:tcPr>
-            <w:tcW w:type="dxa" w:w="2880"/>
+            <w:tcW w:type="dxa" w:w="4320"/>
           </w:tcPr>
           <w:p>
             <w:r/>
@@ -579,77 +763,10 @@
               <w:rPr>
                 <w:rFonts w:ascii="Calibri" w:hAnsi="Calibri"/>
                 <w:b w:val="0"/>
-                <w:sz w:val="18"/>
+                <w:color w:val="000000"/>
+                <w:sz w:val="20"/>
               </w:rPr>
-              <w:t>[ ] SEPARATELY</w:t>
-            </w:r>
-          </w:p>
-        </w:tc>
-      </w:tr>
-      <w:tr>
-        <w:tc>
-          <w:tcPr>
-            <w:tcW w:type="dxa" w:w="1728"/>
-            <w:shd w:val="clear" w:color="auto" w:fill="1F3A5F"/>
-          </w:tcPr>
-          <w:p>
-            <w:r/>
-            <w:r>
-              <w:rPr>
-                <w:rFonts w:ascii="Calibri" w:hAnsi="Calibri"/>
-                <w:b/>
-                <w:color w:val="FFFFFF"/>
-                <w:sz w:val="18"/>
-              </w:rPr>
-              <w:t>ITEM:</w:t>
-            </w:r>
-          </w:p>
-        </w:tc>
-        <w:tc>
-          <w:tcPr>
-            <w:tcW w:type="dxa" w:w="2736"/>
-          </w:tcPr>
-          <w:p>
-            <w:r/>
-            <w:r>
-              <w:rPr>
-                <w:rFonts w:ascii="Calibri" w:hAnsi="Calibri"/>
-                <w:b w:val="0"/>
-                <w:sz w:val="18"/>
-              </w:rPr>
-              <w:t>[ ] ORIGINAL DRAWINGS</w:t>
-            </w:r>
-          </w:p>
-        </w:tc>
-        <w:tc>
-          <w:tcPr>
-            <w:tcW w:type="dxa" w:w="2880"/>
-          </w:tcPr>
-          <w:p>
-            <w:r/>
-            <w:r>
-              <w:rPr>
-                <w:rFonts w:ascii="Calibri" w:hAnsi="Calibri"/>
-                <w:b w:val="0"/>
-                <w:sz w:val="18"/>
-              </w:rPr>
-              <w:t>[ ] COPY OF LETTER</w:t>
-            </w:r>
-          </w:p>
-        </w:tc>
-        <w:tc>
-          <w:tcPr>
-            <w:tcW w:type="dxa" w:w="2880"/>
-          </w:tcPr>
-          <w:p>
-            <w:r/>
-            <w:r>
-              <w:rPr>
-                <w:rFonts w:ascii="Calibri" w:hAnsi="Calibri"/>
-                <w:b w:val="0"/>
-                <w:sz w:val="18"/>
-              </w:rPr>
-              <w:t>[X] SUBMITTALS</w:t>
+              <w:t>COPY OF LETTER</w:t>
             </w:r>
           </w:p>
         </w:tc>
@@ -665,14 +782,15 @@
               <w:rPr>
                 <w:rFonts w:ascii="Calibri" w:hAnsi="Calibri"/>
                 <w:b w:val="0"/>
-                <w:sz w:val="18"/>
+                <w:color w:val="000000"/>
+                <w:sz w:val="20"/>
               </w:rPr>
             </w:r>
           </w:p>
         </w:tc>
         <w:tc>
           <w:tcPr>
-            <w:tcW w:type="dxa" w:w="2736"/>
+            <w:tcW w:type="dxa" w:w="576"/>
           </w:tcPr>
           <w:p>
             <w:r/>
@@ -680,15 +798,15 @@
               <w:rPr>
                 <w:rFonts w:ascii="Calibri" w:hAnsi="Calibri"/>
                 <w:b w:val="0"/>
-                <w:sz w:val="18"/>
+                <w:color w:val="000000"/>
+                <w:sz w:val="20"/>
               </w:rPr>
-              <w:t>[ ] PRINTS</w:t>
             </w:r>
           </w:p>
         </w:tc>
         <w:tc>
           <w:tcPr>
-            <w:tcW w:type="dxa" w:w="2880"/>
+            <w:tcW w:type="dxa" w:w="3024"/>
           </w:tcPr>
           <w:p>
             <w:r/>
@@ -696,15 +814,16 @@
               <w:rPr>
                 <w:rFonts w:ascii="Calibri" w:hAnsi="Calibri"/>
                 <w:b w:val="0"/>
-                <w:sz w:val="18"/>
+                <w:color w:val="000000"/>
+                <w:sz w:val="20"/>
               </w:rPr>
-              <w:t>[ ] SPECIFICATIONS</w:t>
+              <w:t>PRINTS</w:t>
             </w:r>
           </w:p>
         </w:tc>
         <w:tc>
           <w:tcPr>
-            <w:tcW w:type="dxa" w:w="2880"/>
+            <w:tcW w:type="dxa" w:w="576"/>
           </w:tcPr>
           <w:p>
             <w:r/>
@@ -712,9 +831,26 @@
               <w:rPr>
                 <w:rFonts w:ascii="Calibri" w:hAnsi="Calibri"/>
                 <w:b w:val="0"/>
-                <w:sz w:val="18"/>
+                <w:color w:val="000000"/>
+                <w:sz w:val="20"/>
               </w:rPr>
-              <w:t>[ ] SAMPLES</w:t>
+            </w:r>
+          </w:p>
+        </w:tc>
+        <w:tc>
+          <w:tcPr>
+            <w:tcW w:type="dxa" w:w="4320"/>
+          </w:tcPr>
+          <w:p>
+            <w:r/>
+            <w:r>
+              <w:rPr>
+                <w:rFonts w:ascii="Calibri" w:hAnsi="Calibri"/>
+                <w:b w:val="0"/>
+                <w:color w:val="000000"/>
+                <w:sz w:val="20"/>
+              </w:rPr>
+              <w:t>SPECIFICATIONS</w:t>
             </w:r>
           </w:p>
         </w:tc>
@@ -730,14 +866,35 @@
               <w:rPr>
                 <w:rFonts w:ascii="Calibri" w:hAnsi="Calibri"/>
                 <w:b w:val="0"/>
-                <w:sz w:val="18"/>
+                <w:color w:val="000000"/>
+                <w:sz w:val="20"/>
               </w:rPr>
             </w:r>
           </w:p>
         </w:tc>
         <w:tc>
           <w:tcPr>
-            <w:tcW w:type="dxa" w:w="2736"/>
+            <w:tcW w:type="dxa" w:w="576"/>
+          </w:tcPr>
+          <w:p>
+            <w:pPr>
+              <w:jc w:val="center"/>
+            </w:pPr>
+            <w:r/>
+            <w:r>
+              <w:rPr>
+                <w:rFonts w:ascii="Calibri" w:hAnsi="Calibri"/>
+                <w:b/>
+                <w:color w:val="000000"/>
+                <w:sz w:val="20"/>
+              </w:rPr>
+              <w:t>x</w:t>
+            </w:r>
+          </w:p>
+        </w:tc>
+        <w:tc>
+          <w:tcPr>
+            <w:tcW w:type="dxa" w:w="3024"/>
           </w:tcPr>
           <w:p>
             <w:r/>
@@ -745,15 +902,16 @@
               <w:rPr>
                 <w:rFonts w:ascii="Calibri" w:hAnsi="Calibri"/>
                 <w:b w:val="0"/>
-                <w:sz w:val="18"/>
+                <w:color w:val="000000"/>
+                <w:sz w:val="20"/>
               </w:rPr>
-              <w:t>[ ] SPECIFICATIONS</w:t>
+              <w:t>SUBMITTALS</w:t>
             </w:r>
           </w:p>
         </w:tc>
         <w:tc>
           <w:tcPr>
-            <w:tcW w:type="dxa" w:w="2880"/>
+            <w:tcW w:type="dxa" w:w="576"/>
           </w:tcPr>
           <w:p>
             <w:r/>
@@ -761,15 +919,15 @@
               <w:rPr>
                 <w:rFonts w:ascii="Calibri" w:hAnsi="Calibri"/>
                 <w:b w:val="0"/>
-                <w:sz w:val="18"/>
+                <w:color w:val="000000"/>
+                <w:sz w:val="20"/>
               </w:rPr>
-              <w:t>[ ] OTHER</w:t>
             </w:r>
           </w:p>
         </w:tc>
         <w:tc>
           <w:tcPr>
-            <w:tcW w:type="dxa" w:w="2880"/>
+            <w:tcW w:type="dxa" w:w="4320"/>
           </w:tcPr>
           <w:p>
             <w:r/>
@@ -777,32 +935,29 @@
               <w:rPr>
                 <w:rFonts w:ascii="Calibri" w:hAnsi="Calibri"/>
                 <w:b w:val="0"/>
-                <w:sz w:val="18"/>
+                <w:color w:val="000000"/>
+                <w:sz w:val="20"/>
               </w:rPr>
+              <w:t>SAMPLES</w:t>
             </w:r>
           </w:p>
         </w:tc>
       </w:tr>
     </w:tbl>
     <w:p/>
-    <w:p>
-      <w:r>
-        <w:rPr>
-          <w:rFonts w:ascii="Calibri" w:hAnsi="Calibri"/>
-          <w:b/>
-          <w:color w:val="2E75B6"/>
-          <w:sz w:val="20"/>
-        </w:rPr>
-        <w:t>Items Transmitted</w:t>
-      </w:r>
-    </w:p>
     <w:tbl>
       <w:tblPr>
-        <w:tblStyle w:val="LightGrid-Accent1"/>
         <w:tblW w:type="auto" w:w="0"/>
-        <w:jc w:val="left"/>
         <w:tblLayout w:type="fixed"/>
         <w:tblLook w:firstColumn="1" w:firstRow="1" w:lastColumn="0" w:lastRow="0" w:noHBand="0" w:noVBand="1" w:val="04A0"/>
+        <w:tblBorders>
+          <w:top w:val="single" w:sz="4" w:space="0" w:color="7F7F7F"/>
+          <w:left w:val="single" w:sz="4" w:space="0" w:color="7F7F7F"/>
+          <w:bottom w:val="single" w:sz="4" w:space="0" w:color="7F7F7F"/>
+          <w:right w:val="single" w:sz="4" w:space="0" w:color="7F7F7F"/>
+          <w:insideH w:val="single" w:sz="4" w:space="0" w:color="7F7F7F"/>
+          <w:insideV w:val="single" w:sz="4" w:space="0" w:color="7F7F7F"/>
+        </w:tblBorders>
       </w:tblPr>
       <w:tblGrid>
         <w:gridCol w:w="3408"/>
@@ -813,7 +968,7 @@
         <w:tc>
           <w:tcPr>
             <w:tcW w:type="dxa" w:w="1440"/>
-            <w:shd w:val="clear" w:color="auto" w:fill="1F3A5F"/>
+            <w:shd w:val="clear" w:color="auto" w:fill="DAE3F3"/>
           </w:tcPr>
           <w:p>
             <w:r/>
@@ -821,17 +976,17 @@
               <w:rPr>
                 <w:rFonts w:ascii="Calibri" w:hAnsi="Calibri"/>
                 <w:b/>
-                <w:color w:val="FFFFFF"/>
-                <w:sz w:val="18"/>
+                <w:color w:val="000000"/>
+                <w:sz w:val="20"/>
               </w:rPr>
-              <w:t>Quantity</w:t>
+              <w:t>QUANTITY</w:t>
             </w:r>
           </w:p>
         </w:tc>
         <w:tc>
           <w:tcPr>
             <w:tcW w:type="dxa" w:w="1728"/>
-            <w:shd w:val="clear" w:color="auto" w:fill="1F3A5F"/>
+            <w:shd w:val="clear" w:color="auto" w:fill="DAE3F3"/>
           </w:tcPr>
           <w:p>
             <w:r/>
@@ -839,17 +994,17 @@
               <w:rPr>
                 <w:rFonts w:ascii="Calibri" w:hAnsi="Calibri"/>
                 <w:b/>
-                <w:color w:val="FFFFFF"/>
-                <w:sz w:val="18"/>
+                <w:color w:val="000000"/>
+                <w:sz w:val="20"/>
               </w:rPr>
-              <w:t>Dated</w:t>
+              <w:t>DATED</w:t>
             </w:r>
           </w:p>
         </w:tc>
         <w:tc>
           <w:tcPr>
-            <w:tcW w:type="dxa" w:w="6912"/>
-            <w:shd w:val="clear" w:color="auto" w:fill="1F3A5F"/>
+            <w:tcW w:type="dxa" w:w="7056"/>
+            <w:shd w:val="clear" w:color="auto" w:fill="DAE3F3"/>
           </w:tcPr>
           <w:p>
             <w:r/>
@@ -857,10 +1012,10 @@
               <w:rPr>
                 <w:rFonts w:ascii="Calibri" w:hAnsi="Calibri"/>
                 <w:b/>
-                <w:color w:val="FFFFFF"/>
-                <w:sz w:val="18"/>
+                <w:color w:val="000000"/>
+                <w:sz w:val="20"/>
               </w:rPr>
-              <w:t>Description</w:t>
+              <w:t>DESCRIPTION</w:t>
             </w:r>
           </w:p>
         </w:tc>
@@ -876,7 +1031,8 @@
               <w:rPr>
                 <w:rFonts w:ascii="Calibri" w:hAnsi="Calibri"/>
                 <w:b w:val="0"/>
-                <w:sz w:val="18"/>
+                <w:color w:val="000000"/>
+                <w:sz w:val="20"/>
               </w:rPr>
               <w:t>[#]</w:t>
             </w:r>
@@ -892,7 +1048,8 @@
               <w:rPr>
                 <w:rFonts w:ascii="Calibri" w:hAnsi="Calibri"/>
                 <w:b w:val="0"/>
-                <w:sz w:val="18"/>
+                <w:color w:val="000000"/>
+                <w:sz w:val="20"/>
               </w:rPr>
               <w:t>[YYYY-MM-DD]</w:t>
             </w:r>
@@ -900,7 +1057,7 @@
         </w:tc>
         <w:tc>
           <w:tcPr>
-            <w:tcW w:type="dxa" w:w="6912"/>
+            <w:tcW w:type="dxa" w:w="7056"/>
           </w:tcPr>
           <w:p>
             <w:r/>
@@ -908,7 +1065,8 @@
               <w:rPr>
                 <w:rFonts w:ascii="Calibri" w:hAnsi="Calibri"/>
                 <w:b w:val="0"/>
-                <w:sz w:val="18"/>
+                <w:color w:val="000000"/>
+                <w:sz w:val="20"/>
               </w:rPr>
               <w:t>[Description of the transmitted item / submittal package]</w:t>
             </w:r>
@@ -926,7 +1084,8 @@
               <w:rPr>
                 <w:rFonts w:ascii="Calibri" w:hAnsi="Calibri"/>
                 <w:b w:val="0"/>
-                <w:sz w:val="18"/>
+                <w:color w:val="000000"/>
+                <w:sz w:val="20"/>
               </w:rPr>
             </w:r>
           </w:p>
@@ -941,14 +1100,15 @@
               <w:rPr>
                 <w:rFonts w:ascii="Calibri" w:hAnsi="Calibri"/>
                 <w:b w:val="0"/>
-                <w:sz w:val="18"/>
+                <w:color w:val="000000"/>
+                <w:sz w:val="20"/>
               </w:rPr>
             </w:r>
           </w:p>
         </w:tc>
         <w:tc>
           <w:tcPr>
-            <w:tcW w:type="dxa" w:w="6912"/>
+            <w:tcW w:type="dxa" w:w="7056"/>
           </w:tcPr>
           <w:p>
             <w:r/>
@@ -956,7 +1116,8 @@
               <w:rPr>
                 <w:rFonts w:ascii="Calibri" w:hAnsi="Calibri"/>
                 <w:b w:val="0"/>
-                <w:sz w:val="18"/>
+                <w:color w:val="000000"/>
+                <w:sz w:val="20"/>
               </w:rPr>
             </w:r>
           </w:p>
@@ -973,7 +1134,8 @@
               <w:rPr>
                 <w:rFonts w:ascii="Calibri" w:hAnsi="Calibri"/>
                 <w:b w:val="0"/>
-                <w:sz w:val="18"/>
+                <w:color w:val="000000"/>
+                <w:sz w:val="20"/>
               </w:rPr>
             </w:r>
           </w:p>
@@ -988,14 +1150,15 @@
               <w:rPr>
                 <w:rFonts w:ascii="Calibri" w:hAnsi="Calibri"/>
                 <w:b w:val="0"/>
-                <w:sz w:val="18"/>
+                <w:color w:val="000000"/>
+                <w:sz w:val="20"/>
               </w:rPr>
             </w:r>
           </w:p>
         </w:tc>
         <w:tc>
           <w:tcPr>
-            <w:tcW w:type="dxa" w:w="6912"/>
+            <w:tcW w:type="dxa" w:w="7056"/>
           </w:tcPr>
           <w:p>
             <w:r/>
@@ -1003,8 +1166,116 @@
               <w:rPr>
                 <w:rFonts w:ascii="Calibri" w:hAnsi="Calibri"/>
                 <w:b w:val="0"/>
-                <w:sz w:val="18"/>
+                <w:color w:val="000000"/>
+                <w:sz w:val="20"/>
               </w:rPr>
+            </w:r>
+          </w:p>
+        </w:tc>
+      </w:tr>
+      <w:tr>
+        <w:tc>
+          <w:tcPr>
+            <w:tcW w:type="dxa" w:w="1440"/>
+          </w:tcPr>
+          <w:p>
+            <w:r/>
+            <w:r>
+              <w:rPr>
+                <w:rFonts w:ascii="Calibri" w:hAnsi="Calibri"/>
+                <w:b w:val="0"/>
+                <w:color w:val="000000"/>
+                <w:sz w:val="20"/>
+              </w:rPr>
+            </w:r>
+          </w:p>
+        </w:tc>
+        <w:tc>
+          <w:tcPr>
+            <w:tcW w:type="dxa" w:w="1728"/>
+          </w:tcPr>
+          <w:p>
+            <w:r/>
+            <w:r>
+              <w:rPr>
+                <w:rFonts w:ascii="Calibri" w:hAnsi="Calibri"/>
+                <w:b w:val="0"/>
+                <w:color w:val="000000"/>
+                <w:sz w:val="20"/>
+              </w:rPr>
+            </w:r>
+          </w:p>
+        </w:tc>
+        <w:tc>
+          <w:tcPr>
+            <w:tcW w:type="dxa" w:w="7056"/>
+          </w:tcPr>
+          <w:p>
+            <w:r/>
+            <w:r>
+              <w:rPr>
+                <w:rFonts w:ascii="Calibri" w:hAnsi="Calibri"/>
+                <w:b w:val="0"/>
+                <w:color w:val="000000"/>
+                <w:sz w:val="20"/>
+              </w:rPr>
+            </w:r>
+          </w:p>
+        </w:tc>
+      </w:tr>
+    </w:tbl>
+    <w:p/>
+    <w:tbl>
+      <w:tblPr>
+        <w:tblW w:type="auto" w:w="0"/>
+        <w:tblLayout w:type="fixed"/>
+        <w:tblLook w:firstColumn="1" w:firstRow="1" w:lastColumn="0" w:lastRow="0" w:noHBand="0" w:noVBand="1" w:val="04A0"/>
+        <w:tblBorders>
+          <w:top w:val="single" w:sz="4" w:space="0" w:color="7F7F7F"/>
+          <w:left w:val="single" w:sz="4" w:space="0" w:color="7F7F7F"/>
+          <w:bottom w:val="single" w:sz="4" w:space="0" w:color="7F7F7F"/>
+          <w:right w:val="single" w:sz="4" w:space="0" w:color="7F7F7F"/>
+          <w:insideH w:val="single" w:sz="4" w:space="0" w:color="7F7F7F"/>
+          <w:insideV w:val="single" w:sz="4" w:space="0" w:color="7F7F7F"/>
+        </w:tblBorders>
+      </w:tblPr>
+      <w:tblGrid>
+        <w:gridCol w:w="5112"/>
+        <w:gridCol w:w="5112"/>
+      </w:tblGrid>
+      <w:tr>
+        <w:tc>
+          <w:tcPr>
+            <w:tcW w:type="dxa" w:w="1728"/>
+            <w:shd w:val="clear" w:color="auto" w:fill="DAE3F3"/>
+          </w:tcPr>
+          <w:p>
+            <w:r/>
+            <w:r>
+              <w:rPr>
+                <w:rFonts w:ascii="Calibri" w:hAnsi="Calibri"/>
+                <w:b/>
+                <w:color w:val="000000"/>
+                <w:sz w:val="20"/>
+              </w:rPr>
+              <w:t>REMARKS:</w:t>
+            </w:r>
+          </w:p>
+        </w:tc>
+        <w:tc>
+          <w:tcPr>
+            <w:tcW w:type="dxa" w:w="8496"/>
+          </w:tcPr>
+          <w:p>
+            <w:r/>
+            <w:r>
+              <w:rPr>
+                <w:rFonts w:ascii="Calibri" w:hAnsi="Calibri"/>
+                <w:b w:val="0"/>
+                <w:color w:val="000000"/>
+                <w:sz w:val="20"/>
+              </w:rPr>
+              <w:t>[One paragraph summarizing what is enclosed, the spec section it satisfies, and any context the reviewer needs (revision number, scope coverage, related RFIs, requested action).]</w:t>
             </w:r>
           </w:p>
         </w:tc>
@@ -1016,74 +1287,15 @@
         <w:rPr>
           <w:rFonts w:ascii="Calibri" w:hAnsi="Calibri"/>
           <w:b/>
-          <w:color w:val="2E75B6"/>
+          <w:color w:val="000000"/>
           <w:sz w:val="20"/>
         </w:rPr>
-        <w:t>Remarks</w:t>
+        <w:t>By:   [Name, Title]</w:t>
       </w:r>
     </w:p>
-    <w:p>
-      <w:r>
-        <w:rPr>
-          <w:rFonts w:ascii="Calibri" w:hAnsi="Calibri"/>
-          <w:b w:val="0"/>
-          <w:sz w:val="20"/>
-        </w:rPr>
-        <w:t>[One paragraph summarizing what is enclosed, the spec section it satisfies, and any context the reviewer needs (revision number, scope coverage, related RFIs, requested action).]</w:t>
-      </w:r>
-    </w:p>
-    <w:p/>
-    <w:tbl>
-      <w:tblPr>
-        <w:tblStyle w:val="LightList-Accent1"/>
-        <w:tblW w:type="auto" w:w="0"/>
-        <w:tblLayout w:type="fixed"/>
-        <w:tblLook w:firstColumn="1" w:firstRow="1" w:lastColumn="0" w:lastRow="0" w:noHBand="0" w:noVBand="1" w:val="04A0"/>
-      </w:tblPr>
-      <w:tblGrid>
-        <w:gridCol w:w="5112"/>
-        <w:gridCol w:w="5112"/>
-      </w:tblGrid>
-      <w:tr>
-        <w:tc>
-          <w:tcPr>
-            <w:tcW w:type="dxa" w:w="1440"/>
-            <w:shd w:val="clear" w:color="auto" w:fill="1F3A5F"/>
-          </w:tcPr>
-          <w:p>
-            <w:r/>
-            <w:r>
-              <w:rPr>
-                <w:rFonts w:ascii="Calibri" w:hAnsi="Calibri"/>
-                <w:b/>
-                <w:color w:val="FFFFFF"/>
-                <w:sz w:val="18"/>
-              </w:rPr>
-              <w:t>By:</w:t>
-            </w:r>
-          </w:p>
-        </w:tc>
-        <w:tc>
-          <w:tcPr>
-            <w:tcW w:type="dxa" w:w="8640"/>
-          </w:tcPr>
-          <w:p>
-            <w:r/>
-            <w:r>
-              <w:rPr>
-                <w:rFonts w:ascii="Calibri" w:hAnsi="Calibri"/>
-                <w:b w:val="0"/>
-                <w:sz w:val="20"/>
-              </w:rPr>
-              <w:t>[Name, Title]</w:t>
-            </w:r>
-          </w:p>
-        </w:tc>
-      </w:tr>
-    </w:tbl>
     <w:sectPr>
       <w:pgSz w:w="12240" w:h="15840"/>
-      <w:pgMar w:top="1008" w:right="1008" w:bottom="1008" w:left="1008" w:header="720" w:footer="720" w:gutter="0"/>
+      <w:pgMar w:top="864" w:right="1008" w:bottom="864" w:left="1008" w:header="720" w:footer="720" w:gutter="0"/>
       <w:cols w:space="720"/>
       <w:docGrid w:linePitch="360"/>
     </w:sectPr>

</xml_diff>

<commit_message>
Match real submittal style: add A/E red stamp, fix titles
Transmittal:
- Adds the empty red A/E REVIEW STAMP area at the bottom (REVIEWED /
  FURNISH AS CORRECTED / REVISE AND RESUBMIT / REJECTED checkboxes,
  the standard general-conformance disclaimer in red, plus Date/By and
  an A/E firm block). Caption notes this section is filled in by the
  Architect/Engineer on return.

Cover Sheet:
- Replaces the dark-navy banner with the actual style: centered black
  bold title, blue subtitle, thin blue horizontal rule.
- Section headers are bold uppercase with a thin gray bottom rule.
- KV pairs are plain bold-label / plain-value text (no fill-in lines).

Index:
- Same centered-title treatment as Cover Sheet.
- Adds Contractor's Remarks section with its own table (# / Remark /
  Spec Ref. / Status).
- Adds italic blue footer line with Submittal No. / Date / CSP # / A/E #.
</commit_message>
<xml_diff>
--- a/templates/submittals/01_Transmittal.docx
+++ b/templates/submittals/01_Transmittal.docx
@@ -7,8 +7,10 @@
         <w:rPr>
           <w:rFonts w:ascii="Calibri" w:hAnsi="Calibri"/>
           <w:b/>
+          <w:i w:val="0"/>
           <w:color w:val="000000"/>
           <w:sz w:val="22"/>
+          <w:u w:val="none"/>
         </w:rPr>
         <w:t>[Company Name]</w:t>
       </w:r>
@@ -18,8 +20,10 @@
         <w:rPr>
           <w:rFonts w:ascii="Calibri" w:hAnsi="Calibri"/>
           <w:b w:val="0"/>
+          <w:i w:val="0"/>
           <w:color w:val="000000"/>
           <w:sz w:val="18"/>
+          <w:u w:val="none"/>
         </w:rPr>
         <w:t>[Street Address]</w:t>
       </w:r>
@@ -29,8 +33,10 @@
         <w:rPr>
           <w:rFonts w:ascii="Calibri" w:hAnsi="Calibri"/>
           <w:b w:val="0"/>
+          <w:i w:val="0"/>
           <w:color w:val="000000"/>
           <w:sz w:val="18"/>
+          <w:u w:val="none"/>
         </w:rPr>
         <w:t>[City, State ZIP]</w:t>
       </w:r>
@@ -40,8 +46,10 @@
         <w:rPr>
           <w:rFonts w:ascii="Calibri" w:hAnsi="Calibri"/>
           <w:b w:val="0"/>
+          <w:i w:val="0"/>
           <w:color w:val="000000"/>
           <w:sz w:val="18"/>
+          <w:u w:val="none"/>
         </w:rPr>
         <w:t>[Phone]</w:t>
       </w:r>
@@ -51,6 +59,7 @@
         <w:rPr>
           <w:rFonts w:ascii="Calibri" w:hAnsi="Calibri"/>
           <w:b w:val="0"/>
+          <w:i w:val="0"/>
           <w:color w:val="0563C1"/>
           <w:sz w:val="18"/>
           <w:u w:val="single"/>
@@ -67,8 +76,10 @@
         <w:rPr>
           <w:rFonts w:ascii="Calibri" w:hAnsi="Calibri"/>
           <w:b/>
+          <w:i w:val="0"/>
           <w:color w:val="000000"/>
           <w:sz w:val="40"/>
+          <w:u w:val="none"/>
         </w:rPr>
         <w:t>TRANSMITTAL</w:t>
       </w:r>
@@ -104,8 +115,10 @@
               <w:rPr>
                 <w:rFonts w:ascii="Calibri" w:hAnsi="Calibri"/>
                 <w:b/>
+                <w:i w:val="0"/>
                 <w:color w:val="000000"/>
                 <w:sz w:val="20"/>
+                <w:u w:val="none"/>
               </w:rPr>
               <w:t>DATE:</w:t>
             </w:r>
@@ -121,8 +134,10 @@
               <w:rPr>
                 <w:rFonts w:ascii="Calibri" w:hAnsi="Calibri"/>
                 <w:b w:val="0"/>
+                <w:i w:val="0"/>
                 <w:color w:val="000000"/>
                 <w:sz w:val="20"/>
+                <w:u w:val="none"/>
               </w:rPr>
               <w:t>[YYYY-MM-DD]</w:t>
             </w:r>
@@ -163,8 +178,10 @@
               <w:rPr>
                 <w:rFonts w:ascii="Calibri" w:hAnsi="Calibri"/>
                 <w:b/>
+                <w:i w:val="0"/>
                 <w:color w:val="000000"/>
                 <w:sz w:val="20"/>
+                <w:u w:val="none"/>
               </w:rPr>
               <w:t>TO:</w:t>
             </w:r>
@@ -180,8 +197,10 @@
               <w:rPr>
                 <w:rFonts w:ascii="Calibri" w:hAnsi="Calibri"/>
                 <w:b w:val="0"/>
+                <w:i w:val="0"/>
                 <w:color w:val="000000"/>
                 <w:sz w:val="20"/>
+                <w:u w:val="none"/>
               </w:rPr>
               <w:t>[Recipient Firm]</w:t>
             </w:r>
@@ -198,8 +217,10 @@
               <w:rPr>
                 <w:rFonts w:ascii="Calibri" w:hAnsi="Calibri"/>
                 <w:b/>
+                <w:i w:val="0"/>
                 <w:color w:val="000000"/>
                 <w:sz w:val="20"/>
+                <w:u w:val="none"/>
               </w:rPr>
               <w:t>VIA:</w:t>
             </w:r>
@@ -215,8 +236,10 @@
               <w:rPr>
                 <w:rFonts w:ascii="Calibri" w:hAnsi="Calibri"/>
                 <w:b w:val="0"/>
+                <w:i w:val="0"/>
                 <w:color w:val="000000"/>
                 <w:sz w:val="20"/>
+                <w:u w:val="none"/>
               </w:rPr>
               <w:t>U.S. MAIL</w:t>
             </w:r>
@@ -235,8 +258,10 @@
               <w:rPr>
                 <w:rFonts w:ascii="Calibri" w:hAnsi="Calibri"/>
                 <w:b/>
+                <w:i w:val="0"/>
                 <w:color w:val="000000"/>
                 <w:sz w:val="20"/>
+                <w:u w:val="none"/>
               </w:rPr>
               <w:t>ATTN:</w:t>
             </w:r>
@@ -252,8 +277,10 @@
               <w:rPr>
                 <w:rFonts w:ascii="Calibri" w:hAnsi="Calibri"/>
                 <w:b w:val="0"/>
+                <w:i w:val="0"/>
                 <w:color w:val="000000"/>
                 <w:sz w:val="20"/>
+                <w:u w:val="none"/>
               </w:rPr>
               <w:t>[Recipient Name]</w:t>
             </w:r>
@@ -269,8 +296,10 @@
               <w:rPr>
                 <w:rFonts w:ascii="Calibri" w:hAnsi="Calibri"/>
                 <w:b w:val="0"/>
+                <w:i w:val="0"/>
                 <w:color w:val="000000"/>
                 <w:sz w:val="20"/>
+                <w:u w:val="none"/>
               </w:rPr>
             </w:r>
           </w:p>
@@ -285,8 +314,10 @@
               <w:rPr>
                 <w:rFonts w:ascii="Calibri" w:hAnsi="Calibri"/>
                 <w:b w:val="0"/>
+                <w:i w:val="0"/>
                 <w:color w:val="000000"/>
                 <w:sz w:val="20"/>
+                <w:u w:val="none"/>
               </w:rPr>
               <w:t>HAND DELIVERED</w:t>
             </w:r>
@@ -304,8 +335,10 @@
               <w:rPr>
                 <w:rFonts w:ascii="Calibri" w:hAnsi="Calibri"/>
                 <w:b w:val="0"/>
+                <w:i w:val="0"/>
                 <w:color w:val="000000"/>
                 <w:sz w:val="20"/>
+                <w:u w:val="none"/>
               </w:rPr>
             </w:r>
           </w:p>
@@ -320,8 +353,10 @@
               <w:rPr>
                 <w:rFonts w:ascii="Calibri" w:hAnsi="Calibri"/>
                 <w:b w:val="0"/>
+                <w:i w:val="0"/>
                 <w:color w:val="000000"/>
                 <w:sz w:val="20"/>
+                <w:u w:val="none"/>
               </w:rPr>
               <w:t>[Street Address]</w:t>
             </w:r>
@@ -337,8 +372,10 @@
               <w:rPr>
                 <w:rFonts w:ascii="Calibri" w:hAnsi="Calibri"/>
                 <w:b w:val="0"/>
+                <w:i w:val="0"/>
                 <w:color w:val="000000"/>
                 <w:sz w:val="20"/>
+                <w:u w:val="none"/>
               </w:rPr>
             </w:r>
           </w:p>
@@ -353,8 +390,10 @@
               <w:rPr>
                 <w:rFonts w:ascii="Calibri" w:hAnsi="Calibri"/>
                 <w:b w:val="0"/>
+                <w:i w:val="0"/>
                 <w:color w:val="000000"/>
                 <w:sz w:val="20"/>
+                <w:u w:val="none"/>
               </w:rPr>
               <w:t>LOCAL DELIVERY</w:t>
             </w:r>
@@ -372,8 +411,10 @@
               <w:rPr>
                 <w:rFonts w:ascii="Calibri" w:hAnsi="Calibri"/>
                 <w:b w:val="0"/>
+                <w:i w:val="0"/>
                 <w:color w:val="000000"/>
                 <w:sz w:val="20"/>
+                <w:u w:val="none"/>
               </w:rPr>
             </w:r>
           </w:p>
@@ -388,8 +429,10 @@
               <w:rPr>
                 <w:rFonts w:ascii="Calibri" w:hAnsi="Calibri"/>
                 <w:b w:val="0"/>
+                <w:i w:val="0"/>
                 <w:color w:val="000000"/>
                 <w:sz w:val="20"/>
+                <w:u w:val="none"/>
               </w:rPr>
               <w:t>[City, State ZIP]</w:t>
             </w:r>
@@ -405,8 +448,10 @@
               <w:rPr>
                 <w:rFonts w:ascii="Calibri" w:hAnsi="Calibri"/>
                 <w:b w:val="0"/>
+                <w:i w:val="0"/>
                 <w:color w:val="000000"/>
                 <w:sz w:val="20"/>
+                <w:u w:val="none"/>
               </w:rPr>
             </w:r>
           </w:p>
@@ -421,8 +466,10 @@
               <w:rPr>
                 <w:rFonts w:ascii="Calibri" w:hAnsi="Calibri"/>
                 <w:b w:val="0"/>
+                <w:i w:val="0"/>
                 <w:color w:val="000000"/>
                 <w:sz w:val="20"/>
+                <w:u w:val="none"/>
               </w:rPr>
               <w:t>OVERNIGHT SHIPMENT</w:t>
             </w:r>
@@ -440,8 +487,10 @@
               <w:rPr>
                 <w:rFonts w:ascii="Calibri" w:hAnsi="Calibri"/>
                 <w:b w:val="0"/>
+                <w:i w:val="0"/>
                 <w:color w:val="000000"/>
                 <w:sz w:val="20"/>
+                <w:u w:val="none"/>
               </w:rPr>
             </w:r>
           </w:p>
@@ -456,8 +505,10 @@
               <w:rPr>
                 <w:rFonts w:ascii="Calibri" w:hAnsi="Calibri"/>
                 <w:b w:val="0"/>
+                <w:i w:val="0"/>
                 <w:color w:val="000000"/>
                 <w:sz w:val="20"/>
+                <w:u w:val="none"/>
               </w:rPr>
             </w:r>
           </w:p>
@@ -475,8 +526,10 @@
               <w:rPr>
                 <w:rFonts w:ascii="Calibri" w:hAnsi="Calibri"/>
                 <w:b/>
+                <w:i w:val="0"/>
                 <w:color w:val="000000"/>
                 <w:sz w:val="20"/>
+                <w:u w:val="none"/>
               </w:rPr>
               <w:t>x</w:t>
             </w:r>
@@ -492,8 +545,10 @@
               <w:rPr>
                 <w:rFonts w:ascii="Calibri" w:hAnsi="Calibri"/>
                 <w:b w:val="0"/>
+                <w:i w:val="0"/>
                 <w:color w:val="000000"/>
                 <w:sz w:val="20"/>
+                <w:u w:val="none"/>
               </w:rPr>
               <w:t>Email</w:t>
             </w:r>
@@ -512,8 +567,10 @@
               <w:rPr>
                 <w:rFonts w:ascii="Calibri" w:hAnsi="Calibri"/>
                 <w:b/>
+                <w:i w:val="0"/>
                 <w:color w:val="000000"/>
                 <w:sz w:val="20"/>
+                <w:u w:val="none"/>
               </w:rPr>
               <w:t>PROJECT:</w:t>
             </w:r>
@@ -529,8 +586,10 @@
               <w:rPr>
                 <w:rFonts w:ascii="Calibri" w:hAnsi="Calibri"/>
                 <w:b w:val="0"/>
+                <w:i w:val="0"/>
                 <w:color w:val="000000"/>
                 <w:sz w:val="20"/>
+                <w:u w:val="none"/>
               </w:rPr>
               <w:t>[Project Name]</w:t>
             </w:r>
@@ -547,8 +606,10 @@
               <w:rPr>
                 <w:rFonts w:ascii="Calibri" w:hAnsi="Calibri"/>
                 <w:b/>
+                <w:i w:val="0"/>
                 <w:color w:val="000000"/>
                 <w:sz w:val="20"/>
+                <w:u w:val="none"/>
               </w:rPr>
               <w:t>PROJECT #</w:t>
             </w:r>
@@ -564,8 +625,10 @@
               <w:rPr>
                 <w:rFonts w:ascii="Calibri" w:hAnsi="Calibri"/>
                 <w:b w:val="0"/>
+                <w:i w:val="0"/>
                 <w:color w:val="000000"/>
                 <w:sz w:val="20"/>
+                <w:u w:val="none"/>
               </w:rPr>
               <w:t>[Project #]</w:t>
             </w:r>
@@ -607,8 +670,10 @@
               <w:rPr>
                 <w:rFonts w:ascii="Calibri" w:hAnsi="Calibri"/>
                 <w:b/>
+                <w:i w:val="0"/>
                 <w:color w:val="000000"/>
                 <w:sz w:val="20"/>
+                <w:u w:val="none"/>
               </w:rPr>
               <w:t>TRANSMITTED:</w:t>
             </w:r>
@@ -627,8 +692,10 @@
               <w:rPr>
                 <w:rFonts w:ascii="Calibri" w:hAnsi="Calibri"/>
                 <w:b/>
+                <w:i w:val="0"/>
                 <w:color w:val="000000"/>
                 <w:sz w:val="20"/>
+                <w:u w:val="none"/>
               </w:rPr>
               <w:t>x</w:t>
             </w:r>
@@ -644,8 +711,10 @@
               <w:rPr>
                 <w:rFonts w:ascii="Calibri" w:hAnsi="Calibri"/>
                 <w:b w:val="0"/>
+                <w:i w:val="0"/>
                 <w:color w:val="000000"/>
                 <w:sz w:val="20"/>
+                <w:u w:val="none"/>
               </w:rPr>
               <w:t>HEREWITH</w:t>
             </w:r>
@@ -661,8 +730,10 @@
               <w:rPr>
                 <w:rFonts w:ascii="Calibri" w:hAnsi="Calibri"/>
                 <w:b w:val="0"/>
+                <w:i w:val="0"/>
                 <w:color w:val="000000"/>
                 <w:sz w:val="20"/>
+                <w:u w:val="none"/>
               </w:rPr>
             </w:r>
           </w:p>
@@ -677,8 +748,10 @@
               <w:rPr>
                 <w:rFonts w:ascii="Calibri" w:hAnsi="Calibri"/>
                 <w:b w:val="0"/>
+                <w:i w:val="0"/>
                 <w:color w:val="000000"/>
                 <w:sz w:val="20"/>
+                <w:u w:val="none"/>
               </w:rPr>
               <w:t>SEPARATELY</w:t>
             </w:r>
@@ -697,8 +770,10 @@
               <w:rPr>
                 <w:rFonts w:ascii="Calibri" w:hAnsi="Calibri"/>
                 <w:b/>
+                <w:i w:val="0"/>
                 <w:color w:val="000000"/>
                 <w:sz w:val="20"/>
+                <w:u w:val="none"/>
               </w:rPr>
               <w:t>ITEM:</w:t>
             </w:r>
@@ -714,8 +789,10 @@
               <w:rPr>
                 <w:rFonts w:ascii="Calibri" w:hAnsi="Calibri"/>
                 <w:b w:val="0"/>
+                <w:i w:val="0"/>
                 <w:color w:val="000000"/>
                 <w:sz w:val="20"/>
+                <w:u w:val="none"/>
               </w:rPr>
             </w:r>
           </w:p>
@@ -730,8 +807,10 @@
               <w:rPr>
                 <w:rFonts w:ascii="Calibri" w:hAnsi="Calibri"/>
                 <w:b w:val="0"/>
+                <w:i w:val="0"/>
                 <w:color w:val="000000"/>
                 <w:sz w:val="20"/>
+                <w:u w:val="none"/>
               </w:rPr>
               <w:t>ORIGINAL DRAWINGS</w:t>
             </w:r>
@@ -747,8 +826,10 @@
               <w:rPr>
                 <w:rFonts w:ascii="Calibri" w:hAnsi="Calibri"/>
                 <w:b w:val="0"/>
+                <w:i w:val="0"/>
                 <w:color w:val="000000"/>
                 <w:sz w:val="20"/>
+                <w:u w:val="none"/>
               </w:rPr>
             </w:r>
           </w:p>
@@ -763,8 +844,10 @@
               <w:rPr>
                 <w:rFonts w:ascii="Calibri" w:hAnsi="Calibri"/>
                 <w:b w:val="0"/>
+                <w:i w:val="0"/>
                 <w:color w:val="000000"/>
                 <w:sz w:val="20"/>
+                <w:u w:val="none"/>
               </w:rPr>
               <w:t>COPY OF LETTER</w:t>
             </w:r>
@@ -782,8 +865,10 @@
               <w:rPr>
                 <w:rFonts w:ascii="Calibri" w:hAnsi="Calibri"/>
                 <w:b w:val="0"/>
+                <w:i w:val="0"/>
                 <w:color w:val="000000"/>
                 <w:sz w:val="20"/>
+                <w:u w:val="none"/>
               </w:rPr>
             </w:r>
           </w:p>
@@ -798,8 +883,10 @@
               <w:rPr>
                 <w:rFonts w:ascii="Calibri" w:hAnsi="Calibri"/>
                 <w:b w:val="0"/>
+                <w:i w:val="0"/>
                 <w:color w:val="000000"/>
                 <w:sz w:val="20"/>
+                <w:u w:val="none"/>
               </w:rPr>
             </w:r>
           </w:p>
@@ -814,8 +901,10 @@
               <w:rPr>
                 <w:rFonts w:ascii="Calibri" w:hAnsi="Calibri"/>
                 <w:b w:val="0"/>
+                <w:i w:val="0"/>
                 <w:color w:val="000000"/>
                 <w:sz w:val="20"/>
+                <w:u w:val="none"/>
               </w:rPr>
               <w:t>PRINTS</w:t>
             </w:r>
@@ -831,8 +920,10 @@
               <w:rPr>
                 <w:rFonts w:ascii="Calibri" w:hAnsi="Calibri"/>
                 <w:b w:val="0"/>
+                <w:i w:val="0"/>
                 <w:color w:val="000000"/>
                 <w:sz w:val="20"/>
+                <w:u w:val="none"/>
               </w:rPr>
             </w:r>
           </w:p>
@@ -847,8 +938,10 @@
               <w:rPr>
                 <w:rFonts w:ascii="Calibri" w:hAnsi="Calibri"/>
                 <w:b w:val="0"/>
+                <w:i w:val="0"/>
                 <w:color w:val="000000"/>
                 <w:sz w:val="20"/>
+                <w:u w:val="none"/>
               </w:rPr>
               <w:t>SPECIFICATIONS</w:t>
             </w:r>
@@ -866,8 +959,10 @@
               <w:rPr>
                 <w:rFonts w:ascii="Calibri" w:hAnsi="Calibri"/>
                 <w:b w:val="0"/>
+                <w:i w:val="0"/>
                 <w:color w:val="000000"/>
                 <w:sz w:val="20"/>
+                <w:u w:val="none"/>
               </w:rPr>
             </w:r>
           </w:p>
@@ -885,8 +980,10 @@
               <w:rPr>
                 <w:rFonts w:ascii="Calibri" w:hAnsi="Calibri"/>
                 <w:b/>
+                <w:i w:val="0"/>
                 <w:color w:val="000000"/>
                 <w:sz w:val="20"/>
+                <w:u w:val="none"/>
               </w:rPr>
               <w:t>x</w:t>
             </w:r>
@@ -902,8 +999,10 @@
               <w:rPr>
                 <w:rFonts w:ascii="Calibri" w:hAnsi="Calibri"/>
                 <w:b w:val="0"/>
+                <w:i w:val="0"/>
                 <w:color w:val="000000"/>
                 <w:sz w:val="20"/>
+                <w:u w:val="none"/>
               </w:rPr>
               <w:t>SUBMITTALS</w:t>
             </w:r>
@@ -919,8 +1018,10 @@
               <w:rPr>
                 <w:rFonts w:ascii="Calibri" w:hAnsi="Calibri"/>
                 <w:b w:val="0"/>
+                <w:i w:val="0"/>
                 <w:color w:val="000000"/>
                 <w:sz w:val="20"/>
+                <w:u w:val="none"/>
               </w:rPr>
             </w:r>
           </w:p>
@@ -935,8 +1036,10 @@
               <w:rPr>
                 <w:rFonts w:ascii="Calibri" w:hAnsi="Calibri"/>
                 <w:b w:val="0"/>
+                <w:i w:val="0"/>
                 <w:color w:val="000000"/>
                 <w:sz w:val="20"/>
+                <w:u w:val="none"/>
               </w:rPr>
               <w:t>SAMPLES</w:t>
             </w:r>
@@ -976,8 +1079,10 @@
               <w:rPr>
                 <w:rFonts w:ascii="Calibri" w:hAnsi="Calibri"/>
                 <w:b/>
+                <w:i w:val="0"/>
                 <w:color w:val="000000"/>
                 <w:sz w:val="20"/>
+                <w:u w:val="none"/>
               </w:rPr>
               <w:t>QUANTITY</w:t>
             </w:r>
@@ -994,8 +1099,10 @@
               <w:rPr>
                 <w:rFonts w:ascii="Calibri" w:hAnsi="Calibri"/>
                 <w:b/>
+                <w:i w:val="0"/>
                 <w:color w:val="000000"/>
                 <w:sz w:val="20"/>
+                <w:u w:val="none"/>
               </w:rPr>
               <w:t>DATED</w:t>
             </w:r>
@@ -1012,8 +1119,10 @@
               <w:rPr>
                 <w:rFonts w:ascii="Calibri" w:hAnsi="Calibri"/>
                 <w:b/>
+                <w:i w:val="0"/>
                 <w:color w:val="000000"/>
                 <w:sz w:val="20"/>
+                <w:u w:val="none"/>
               </w:rPr>
               <w:t>DESCRIPTION</w:t>
             </w:r>
@@ -1026,13 +1135,18 @@
             <w:tcW w:type="dxa" w:w="1440"/>
           </w:tcPr>
           <w:p>
+            <w:pPr>
+              <w:jc w:val="center"/>
+            </w:pPr>
             <w:r/>
             <w:r>
               <w:rPr>
                 <w:rFonts w:ascii="Calibri" w:hAnsi="Calibri"/>
                 <w:b w:val="0"/>
+                <w:i w:val="0"/>
                 <w:color w:val="000000"/>
                 <w:sz w:val="20"/>
+                <w:u w:val="none"/>
               </w:rPr>
               <w:t>[#]</w:t>
             </w:r>
@@ -1043,13 +1157,18 @@
             <w:tcW w:type="dxa" w:w="1728"/>
           </w:tcPr>
           <w:p>
+            <w:pPr>
+              <w:jc w:val="center"/>
+            </w:pPr>
             <w:r/>
             <w:r>
               <w:rPr>
                 <w:rFonts w:ascii="Calibri" w:hAnsi="Calibri"/>
                 <w:b w:val="0"/>
+                <w:i w:val="0"/>
                 <w:color w:val="000000"/>
                 <w:sz w:val="20"/>
+                <w:u w:val="none"/>
               </w:rPr>
               <w:t>[YYYY-MM-DD]</w:t>
             </w:r>
@@ -1065,8 +1184,10 @@
               <w:rPr>
                 <w:rFonts w:ascii="Calibri" w:hAnsi="Calibri"/>
                 <w:b w:val="0"/>
+                <w:i w:val="0"/>
                 <w:color w:val="000000"/>
                 <w:sz w:val="20"/>
+                <w:u w:val="none"/>
               </w:rPr>
               <w:t>[Description of the transmitted item / submittal package]</w:t>
             </w:r>
@@ -1084,8 +1205,10 @@
               <w:rPr>
                 <w:rFonts w:ascii="Calibri" w:hAnsi="Calibri"/>
                 <w:b w:val="0"/>
+                <w:i w:val="0"/>
                 <w:color w:val="000000"/>
                 <w:sz w:val="20"/>
+                <w:u w:val="none"/>
               </w:rPr>
             </w:r>
           </w:p>
@@ -1100,8 +1223,10 @@
               <w:rPr>
                 <w:rFonts w:ascii="Calibri" w:hAnsi="Calibri"/>
                 <w:b w:val="0"/>
+                <w:i w:val="0"/>
                 <w:color w:val="000000"/>
                 <w:sz w:val="20"/>
+                <w:u w:val="none"/>
               </w:rPr>
             </w:r>
           </w:p>
@@ -1116,8 +1241,10 @@
               <w:rPr>
                 <w:rFonts w:ascii="Calibri" w:hAnsi="Calibri"/>
                 <w:b w:val="0"/>
+                <w:i w:val="0"/>
                 <w:color w:val="000000"/>
                 <w:sz w:val="20"/>
+                <w:u w:val="none"/>
               </w:rPr>
             </w:r>
           </w:p>
@@ -1134,8 +1261,10 @@
               <w:rPr>
                 <w:rFonts w:ascii="Calibri" w:hAnsi="Calibri"/>
                 <w:b w:val="0"/>
+                <w:i w:val="0"/>
                 <w:color w:val="000000"/>
                 <w:sz w:val="20"/>
+                <w:u w:val="none"/>
               </w:rPr>
             </w:r>
           </w:p>
@@ -1150,8 +1279,10 @@
               <w:rPr>
                 <w:rFonts w:ascii="Calibri" w:hAnsi="Calibri"/>
                 <w:b w:val="0"/>
+                <w:i w:val="0"/>
                 <w:color w:val="000000"/>
                 <w:sz w:val="20"/>
+                <w:u w:val="none"/>
               </w:rPr>
             </w:r>
           </w:p>
@@ -1166,8 +1297,10 @@
               <w:rPr>
                 <w:rFonts w:ascii="Calibri" w:hAnsi="Calibri"/>
                 <w:b w:val="0"/>
+                <w:i w:val="0"/>
                 <w:color w:val="000000"/>
                 <w:sz w:val="20"/>
+                <w:u w:val="none"/>
               </w:rPr>
             </w:r>
           </w:p>
@@ -1184,8 +1317,10 @@
               <w:rPr>
                 <w:rFonts w:ascii="Calibri" w:hAnsi="Calibri"/>
                 <w:b w:val="0"/>
+                <w:i w:val="0"/>
                 <w:color w:val="000000"/>
                 <w:sz w:val="20"/>
+                <w:u w:val="none"/>
               </w:rPr>
             </w:r>
           </w:p>
@@ -1200,8 +1335,10 @@
               <w:rPr>
                 <w:rFonts w:ascii="Calibri" w:hAnsi="Calibri"/>
                 <w:b w:val="0"/>
+                <w:i w:val="0"/>
                 <w:color w:val="000000"/>
                 <w:sz w:val="20"/>
+                <w:u w:val="none"/>
               </w:rPr>
             </w:r>
           </w:p>
@@ -1216,8 +1353,10 @@
               <w:rPr>
                 <w:rFonts w:ascii="Calibri" w:hAnsi="Calibri"/>
                 <w:b w:val="0"/>
+                <w:i w:val="0"/>
                 <w:color w:val="000000"/>
                 <w:sz w:val="20"/>
+                <w:u w:val="none"/>
               </w:rPr>
             </w:r>
           </w:p>
@@ -1255,8 +1394,10 @@
               <w:rPr>
                 <w:rFonts w:ascii="Calibri" w:hAnsi="Calibri"/>
                 <w:b/>
+                <w:i w:val="0"/>
                 <w:color w:val="000000"/>
                 <w:sz w:val="20"/>
+                <w:u w:val="none"/>
               </w:rPr>
               <w:t>REMARKS:</w:t>
             </w:r>
@@ -1272,8 +1413,10 @@
               <w:rPr>
                 <w:rFonts w:ascii="Calibri" w:hAnsi="Calibri"/>
                 <w:b w:val="0"/>
+                <w:i w:val="0"/>
                 <w:color w:val="000000"/>
                 <w:sz w:val="20"/>
+                <w:u w:val="none"/>
               </w:rPr>
               <w:t>[One paragraph summarizing what is enclosed, the spec section it satisfies, and any context the reviewer needs (revision number, scope coverage, related RFIs, requested action).]</w:t>
             </w:r>
@@ -1282,15 +1425,292 @@
       </w:tr>
     </w:tbl>
     <w:p/>
+    <w:tbl>
+      <w:tblPr>
+        <w:tblW w:type="auto" w:w="0"/>
+        <w:tblLayout w:type="fixed"/>
+        <w:tblLook w:firstColumn="1" w:firstRow="1" w:lastColumn="0" w:lastRow="0" w:noHBand="0" w:noVBand="1" w:val="04A0"/>
+        <w:tblBorders>
+          <w:top w:val="single" w:sz="4" w:space="0" w:color="7F7F7F"/>
+          <w:left w:val="single" w:sz="4" w:space="0" w:color="7F7F7F"/>
+          <w:bottom w:val="single" w:sz="4" w:space="0" w:color="7F7F7F"/>
+          <w:right w:val="single" w:sz="4" w:space="0" w:color="7F7F7F"/>
+          <w:insideH w:val="single" w:sz="4" w:space="0" w:color="7F7F7F"/>
+          <w:insideV w:val="single" w:sz="4" w:space="0" w:color="7F7F7F"/>
+        </w:tblBorders>
+      </w:tblPr>
+      <w:tblGrid>
+        <w:gridCol w:w="5112"/>
+        <w:gridCol w:w="5112"/>
+      </w:tblGrid>
+      <w:tr>
+        <w:tc>
+          <w:tcPr>
+            <w:tcW w:type="dxa" w:w="1440"/>
+            <w:shd w:val="clear" w:color="auto" w:fill="DAE3F3"/>
+          </w:tcPr>
+          <w:p>
+            <w:r/>
+            <w:r>
+              <w:rPr>
+                <w:rFonts w:ascii="Calibri" w:hAnsi="Calibri"/>
+                <w:b/>
+                <w:i w:val="0"/>
+                <w:color w:val="000000"/>
+                <w:sz w:val="20"/>
+                <w:u w:val="none"/>
+              </w:rPr>
+              <w:t>By:</w:t>
+            </w:r>
+          </w:p>
+        </w:tc>
+        <w:tc>
+          <w:tcPr>
+            <w:tcW w:type="dxa" w:w="8784"/>
+          </w:tcPr>
+          <w:p>
+            <w:r/>
+            <w:r>
+              <w:rPr>
+                <w:rFonts w:ascii="Calibri" w:hAnsi="Calibri"/>
+                <w:b w:val="0"/>
+                <w:i w:val="0"/>
+                <w:color w:val="000000"/>
+                <w:sz w:val="20"/>
+                <w:u w:val="none"/>
+              </w:rPr>
+              <w:t>[Name, Title]</w:t>
+            </w:r>
+          </w:p>
+        </w:tc>
+      </w:tr>
+    </w:tbl>
+    <w:p/>
+    <w:p/>
+    <w:tbl>
+      <w:tblPr>
+        <w:tblW w:type="auto" w:w="0"/>
+        <w:tblLayout w:type="fixed"/>
+        <w:tblLook w:firstColumn="1" w:firstRow="1" w:lastColumn="0" w:lastRow="0" w:noHBand="0" w:noVBand="1" w:val="04A0"/>
+      </w:tblPr>
+      <w:tblGrid>
+        <w:gridCol w:w="5112"/>
+        <w:gridCol w:w="5112"/>
+      </w:tblGrid>
+      <w:tr>
+        <w:tc>
+          <w:tcPr>
+            <w:tcW w:type="dxa" w:w="5040"/>
+            <w:tcBorders>
+              <w:top w:val="single" w:sz="12" w:color="C00000"/>
+              <w:left w:val="single" w:sz="12" w:color="C00000"/>
+              <w:bottom w:val="single" w:sz="12" w:color="C00000"/>
+              <w:right w:val="single" w:sz="12" w:color="C00000"/>
+            </w:tcBorders>
+          </w:tcPr>
+          <w:p>
+            <w:r/>
+            <w:r>
+              <w:rPr>
+                <w:rFonts w:ascii="Calibri" w:hAnsi="Calibri"/>
+                <w:b/>
+                <w:i w:val="0"/>
+                <w:color w:val="C00000"/>
+                <w:sz w:val="20"/>
+                <w:u w:val="none"/>
+              </w:rPr>
+              <w:t>[ ]  REVIEWED</w:t>
+            </w:r>
+          </w:p>
+        </w:tc>
+        <w:tc>
+          <w:tcPr>
+            <w:tcW w:type="dxa" w:w="5184"/>
+            <w:tcBorders>
+              <w:top w:val="single" w:sz="12" w:color="C00000"/>
+              <w:left w:val="single" w:sz="12" w:color="C00000"/>
+              <w:bottom w:val="single" w:sz="12" w:color="C00000"/>
+              <w:right w:val="single" w:sz="12" w:color="C00000"/>
+            </w:tcBorders>
+          </w:tcPr>
+          <w:p>
+            <w:r/>
+            <w:r>
+              <w:rPr>
+                <w:rFonts w:ascii="Calibri" w:hAnsi="Calibri"/>
+                <w:b/>
+                <w:i w:val="0"/>
+                <w:color w:val="C00000"/>
+                <w:sz w:val="20"/>
+                <w:u w:val="none"/>
+              </w:rPr>
+              <w:t>[ ]  REVISE AND RESUBMIT</w:t>
+            </w:r>
+          </w:p>
+        </w:tc>
+      </w:tr>
+      <w:tr>
+        <w:tc>
+          <w:tcPr>
+            <w:tcW w:type="dxa" w:w="5040"/>
+            <w:tcBorders>
+              <w:top w:val="single" w:sz="12" w:color="C00000"/>
+              <w:left w:val="single" w:sz="12" w:color="C00000"/>
+              <w:bottom w:val="single" w:sz="12" w:color="C00000"/>
+              <w:right w:val="single" w:sz="12" w:color="C00000"/>
+            </w:tcBorders>
+          </w:tcPr>
+          <w:p>
+            <w:r/>
+            <w:r>
+              <w:rPr>
+                <w:rFonts w:ascii="Calibri" w:hAnsi="Calibri"/>
+                <w:b/>
+                <w:i w:val="0"/>
+                <w:color w:val="C00000"/>
+                <w:sz w:val="20"/>
+                <w:u w:val="none"/>
+              </w:rPr>
+              <w:t>[ ]  FURNISH AS CORRECTED</w:t>
+            </w:r>
+          </w:p>
+        </w:tc>
+        <w:tc>
+          <w:tcPr>
+            <w:tcW w:type="dxa" w:w="5184"/>
+            <w:tcBorders>
+              <w:top w:val="single" w:sz="12" w:color="C00000"/>
+              <w:left w:val="single" w:sz="12" w:color="C00000"/>
+              <w:bottom w:val="single" w:sz="12" w:color="C00000"/>
+              <w:right w:val="single" w:sz="12" w:color="C00000"/>
+            </w:tcBorders>
+          </w:tcPr>
+          <w:p>
+            <w:r/>
+            <w:r>
+              <w:rPr>
+                <w:rFonts w:ascii="Calibri" w:hAnsi="Calibri"/>
+                <w:b/>
+                <w:i w:val="0"/>
+                <w:color w:val="C00000"/>
+                <w:sz w:val="20"/>
+                <w:u w:val="none"/>
+              </w:rPr>
+              <w:t>[ ]  REJECTED</w:t>
+            </w:r>
+          </w:p>
+        </w:tc>
+      </w:tr>
+      <w:tr>
+        <w:tc>
+          <w:tcPr>
+            <w:tcW w:type="dxa" w:w="5184"/>
+            <w:gridSpan w:val="2"/>
+            <w:tcBorders>
+              <w:top w:val="single" w:sz="12" w:color="C00000"/>
+              <w:left w:val="single" w:sz="12" w:color="C00000"/>
+              <w:bottom w:val="single" w:sz="12" w:color="C00000"/>
+              <w:right w:val="single" w:sz="12" w:color="C00000"/>
+            </w:tcBorders>
+          </w:tcPr>
+          <w:p>
+            <w:r/>
+            <w:r>
+              <w:rPr>
+                <w:rFonts w:ascii="Calibri" w:hAnsi="Calibri"/>
+                <w:b w:val="0"/>
+                <w:i w:val="0"/>
+                <w:color w:val="C00000"/>
+                <w:sz w:val="18"/>
+                <w:u w:val="none"/>
+              </w:rPr>
+              <w:t>Checking is only for general conformance with the design concept of the project and general compliance with the information given in the Contract Documents. Any action shown is subject to the requirements of the plans and specifications. Contractor is responsible for dimensions which shall be confirmed and correlated at the job site; fabrication processes and techniques of construction; coordination of his work with that of all other trades; and the satisfactory performance of his work.</w:t>
+            </w:r>
+          </w:p>
+        </w:tc>
+      </w:tr>
+      <w:tr>
+        <w:tc>
+          <w:tcPr>
+            <w:tcW w:type="dxa" w:w="5040"/>
+            <w:tcBorders>
+              <w:top w:val="single" w:sz="12" w:color="C00000"/>
+              <w:left w:val="single" w:sz="12" w:color="C00000"/>
+              <w:bottom w:val="single" w:sz="12" w:color="C00000"/>
+              <w:right w:val="single" w:sz="12" w:color="C00000"/>
+            </w:tcBorders>
+          </w:tcPr>
+          <w:p>
+            <w:r/>
+            <w:r>
+              <w:rPr>
+                <w:rFonts w:ascii="Calibri" w:hAnsi="Calibri"/>
+                <w:b w:val="0"/>
+                <w:i w:val="0"/>
+                <w:color w:val="C00000"/>
+                <w:sz w:val="20"/>
+                <w:u w:val="none"/>
+              </w:rPr>
+              <w:t>Date:  ______________________</w:t>
+              <w:br/>
+              <w:br/>
+              <w:t>By:    ______________________</w:t>
+            </w:r>
+          </w:p>
+        </w:tc>
+        <w:tc>
+          <w:tcPr>
+            <w:tcW w:type="dxa" w:w="5184"/>
+            <w:tcBorders>
+              <w:top w:val="single" w:sz="12" w:color="C00000"/>
+              <w:left w:val="single" w:sz="12" w:color="C00000"/>
+              <w:bottom w:val="single" w:sz="12" w:color="C00000"/>
+              <w:right w:val="single" w:sz="12" w:color="C00000"/>
+            </w:tcBorders>
+          </w:tcPr>
+          <w:p>
+            <w:pPr>
+              <w:jc w:val="right"/>
+            </w:pPr>
+            <w:r/>
+            <w:r>
+              <w:rPr>
+                <w:rFonts w:ascii="Calibri" w:hAnsi="Calibri"/>
+                <w:b w:val="0"/>
+                <w:i w:val="0"/>
+                <w:color w:val="C00000"/>
+                <w:sz w:val="16"/>
+                <w:u w:val="none"/>
+              </w:rPr>
+              <w:t>[A/E Firm Name]</w:t>
+              <w:br/>
+              <w:t>[City  -  City  -  City]</w:t>
+              <w:br/>
+              <w:t>[Phone]</w:t>
+              <w:br/>
+              <w:t>[Firm Registration No.]</w:t>
+              <w:br/>
+              <w:t>[Website]</w:t>
+            </w:r>
+          </w:p>
+        </w:tc>
+      </w:tr>
+    </w:tbl>
+    <w:p/>
     <w:p>
+      <w:pPr>
+        <w:jc w:val="center"/>
+      </w:pPr>
       <w:r>
         <w:rPr>
           <w:rFonts w:ascii="Calibri" w:hAnsi="Calibri"/>
-          <w:b/>
+          <w:b w:val="0"/>
+          <w:i/>
           <w:color w:val="000000"/>
-          <w:sz w:val="20"/>
+          <w:sz w:val="16"/>
+          <w:u w:val="none"/>
         </w:rPr>
-        <w:t>By:   [Name, Title]</w:t>
+        <w:t>Red review stamp area is completed by the Architect/Engineer on return - left blank by the Contractor at issue.</w:t>
       </w:r>
     </w:p>
     <w:sectPr>

</xml_diff>